<commit_message>
Update Niche Agency v2 with real SocialPilot internal link URLs
Replaced placeholder descriptions with 10 verified live URLs from
socialpilot.co, each with suggested placement context in the article.
</commit_message>
<xml_diff>
--- a/CONTENT_BRIEF__SocialPilot__Niche_Agency_v2.docx
+++ b/CONTENT_BRIEF__SocialPilot__Niche_Agency_v2.docx
@@ -10684,13 +10684,14 @@
         <w:tblLook w:firstColumn="1" w:firstRow="1" w:lastColumn="0" w:lastRow="0" w:noHBand="0" w:noVBand="1" w:val="04A0"/>
       </w:tblPr>
       <w:tblGrid>
-        <w:gridCol w:w="4896"/>
-        <w:gridCol w:w="4896"/>
+        <w:gridCol w:w="3264"/>
+        <w:gridCol w:w="3264"/>
+        <w:gridCol w:w="3264"/>
       </w:tblGrid>
       <w:tr>
         <w:tc>
           <w:tcPr>
-            <w:tcW w:type="dxa" w:w="4896"/>
+            <w:tcW w:type="dxa" w:w="3264"/>
             <w:shd w:val="clear" w:color="auto" w:fill="1A56DB"/>
             <w:tcMar>
               <w:top w:w="80" w:type="dxa"/>
@@ -10716,7 +10717,7 @@
         </w:tc>
         <w:tc>
           <w:tcPr>
-            <w:tcW w:type="dxa" w:w="4896"/>
+            <w:tcW w:type="dxa" w:w="3264"/>
             <w:shd w:val="clear" w:color="auto" w:fill="1A56DB"/>
             <w:tcMar>
               <w:top w:w="80" w:type="dxa"/>
@@ -10736,7 +10737,33 @@
                 <w:color w:val="FFFFFF"/>
                 <w:sz w:val="18"/>
               </w:rPr>
-              <w:t>Target Page / Context</w:t>
+              <w:t>URL</w:t>
+            </w:r>
+          </w:p>
+        </w:tc>
+        <w:tc>
+          <w:tcPr>
+            <w:tcW w:type="dxa" w:w="3264"/>
+            <w:shd w:val="clear" w:color="auto" w:fill="1A56DB"/>
+            <w:tcMar>
+              <w:top w:w="80" w:type="dxa"/>
+              <w:bottom w:w="80" w:type="dxa"/>
+              <w:left w:w="120" w:type="dxa"/>
+              <w:right w:w="120" w:type="dxa"/>
+            </w:tcMar>
+          </w:tcPr>
+          <w:p>
+            <w:pPr>
+              <w:spacing w:before="0" w:after="0"/>
+            </w:pPr>
+            <w:r>
+              <w:rPr>
+                <w:rFonts w:ascii="Calibri" w:hAnsi="Calibri"/>
+                <w:b/>
+                <w:color w:val="FFFFFF"/>
+                <w:sz w:val="18"/>
+              </w:rPr>
+              <w:t>Placement Suggestion</w:t>
             </w:r>
           </w:p>
         </w:tc>
@@ -10744,7 +10771,7 @@
       <w:tr>
         <w:tc>
           <w:tcPr>
-            <w:tcW w:type="dxa" w:w="4896"/>
+            <w:tcW w:type="dxa" w:w="3264"/>
             <w:shd w:val="clear" w:color="auto" w:fill="EEF2FF"/>
             <w:tcMar>
               <w:top w:w="80" w:type="dxa"/>
@@ -10763,13 +10790,13 @@
                 <w:color w:val="141413"/>
                 <w:sz w:val="18"/>
               </w:rPr>
-              <w:t>How to Get Clients for a Social Media Agency</w:t>
+              <w:t>How to get clients for your digital marketing agency</w:t>
             </w:r>
           </w:p>
         </w:tc>
         <w:tc>
           <w:tcPr>
-            <w:tcW w:type="dxa" w:w="4896"/>
+            <w:tcW w:type="dxa" w:w="3264"/>
             <w:shd w:val="clear" w:color="auto" w:fill="EEF2FF"/>
             <w:tcMar>
               <w:top w:w="80" w:type="dxa"/>
@@ -10788,7 +10815,32 @@
                 <w:color w:val="141413"/>
                 <w:sz w:val="18"/>
               </w:rPr>
-              <w:t>SocialPilot blog — agency client acquisition</w:t>
+              <w:t>https://www.socialpilot.co/agency-success-guide/how-to-get-clients-for-digital-marketing</w:t>
+            </w:r>
+          </w:p>
+        </w:tc>
+        <w:tc>
+          <w:tcPr>
+            <w:tcW w:type="dxa" w:w="3264"/>
+            <w:shd w:val="clear" w:color="auto" w:fill="EEF2FF"/>
+            <w:tcMar>
+              <w:top w:w="80" w:type="dxa"/>
+              <w:bottom w:w="80" w:type="dxa"/>
+              <w:left w:w="120" w:type="dxa"/>
+              <w:right w:w="120" w:type="dxa"/>
+            </w:tcMar>
+          </w:tcPr>
+          <w:p>
+            <w:pPr>
+              <w:spacing w:before="0" w:after="0"/>
+            </w:pPr>
+            <w:r>
+              <w:rPr>
+                <w:rFonts w:ascii="Calibri" w:hAnsi="Calibri"/>
+                <w:color w:val="141413"/>
+                <w:sz w:val="18"/>
+              </w:rPr>
+              <w:t>Section 2 (Win Rates) — when discussing how niche agencies generate inbound referrals</w:t>
             </w:r>
           </w:p>
         </w:tc>
@@ -10796,7 +10848,7 @@
       <w:tr>
         <w:tc>
           <w:tcPr>
-            <w:tcW w:type="dxa" w:w="4896"/>
+            <w:tcW w:type="dxa" w:w="3264"/>
             <w:shd w:val="clear" w:color="auto" w:fill="FFFFFF"/>
             <w:tcMar>
               <w:top w:w="80" w:type="dxa"/>
@@ -10815,13 +10867,13 @@
                 <w:color w:val="141413"/>
                 <w:sz w:val="18"/>
               </w:rPr>
-              <w:t>Social Media Management Pricing for Agencies</w:t>
+              <w:t>How to grow a digital marketing agency</w:t>
             </w:r>
           </w:p>
         </w:tc>
         <w:tc>
           <w:tcPr>
-            <w:tcW w:type="dxa" w:w="4896"/>
+            <w:tcW w:type="dxa" w:w="3264"/>
             <w:shd w:val="clear" w:color="auto" w:fill="FFFFFF"/>
             <w:tcMar>
               <w:top w:w="80" w:type="dxa"/>
@@ -10840,7 +10892,32 @@
                 <w:color w:val="141413"/>
                 <w:sz w:val="18"/>
               </w:rPr>
-              <w:t>SocialPilot blog — agency pricing strategy</w:t>
+              <w:t>https://www.socialpilot.co/agency-success-guide/how-to-grow-a-digital-marketing-agency</w:t>
+            </w:r>
+          </w:p>
+        </w:tc>
+        <w:tc>
+          <w:tcPr>
+            <w:tcW w:type="dxa" w:w="3264"/>
+            <w:shd w:val="clear" w:color="auto" w:fill="FFFFFF"/>
+            <w:tcMar>
+              <w:top w:w="80" w:type="dxa"/>
+              <w:bottom w:w="80" w:type="dxa"/>
+              <w:left w:w="120" w:type="dxa"/>
+              <w:right w:w="120" w:type="dxa"/>
+            </w:tcMar>
+          </w:tcPr>
+          <w:p>
+            <w:pPr>
+              <w:spacing w:before="0" w:after="0"/>
+            </w:pPr>
+            <w:r>
+              <w:rPr>
+                <w:rFonts w:ascii="Calibri" w:hAnsi="Calibri"/>
+                <w:color w:val="141413"/>
+                <w:sz w:val="18"/>
+              </w:rPr>
+              <w:t>Intro or Conclusion — when framing niching as a growth lever</w:t>
             </w:r>
           </w:p>
         </w:tc>
@@ -10848,7 +10925,7 @@
       <w:tr>
         <w:tc>
           <w:tcPr>
-            <w:tcW w:type="dxa" w:w="4896"/>
+            <w:tcW w:type="dxa" w:w="3264"/>
             <w:shd w:val="clear" w:color="auto" w:fill="EEF2FF"/>
             <w:tcMar>
               <w:top w:w="80" w:type="dxa"/>
@@ -10867,13 +10944,13 @@
                 <w:color w:val="141413"/>
                 <w:sz w:val="18"/>
               </w:rPr>
-              <w:t>White Label Social Media Management</w:t>
+              <w:t>Performance-based retainers for social media agencies</w:t>
             </w:r>
           </w:p>
         </w:tc>
         <w:tc>
           <w:tcPr>
-            <w:tcW w:type="dxa" w:w="4896"/>
+            <w:tcW w:type="dxa" w:w="3264"/>
             <w:shd w:val="clear" w:color="auto" w:fill="EEF2FF"/>
             <w:tcMar>
               <w:top w:w="80" w:type="dxa"/>
@@ -10892,7 +10969,32 @@
                 <w:color w:val="141413"/>
                 <w:sz w:val="18"/>
               </w:rPr>
-              <w:t>SocialPilot white-label product page</w:t>
+              <w:t>https://www.socialpilot.co/blog/performance-based-retainer-social-media-agency</w:t>
+            </w:r>
+          </w:p>
+        </w:tc>
+        <w:tc>
+          <w:tcPr>
+            <w:tcW w:type="dxa" w:w="3264"/>
+            <w:shd w:val="clear" w:color="auto" w:fill="EEF2FF"/>
+            <w:tcMar>
+              <w:top w:w="80" w:type="dxa"/>
+              <w:bottom w:w="80" w:type="dxa"/>
+              <w:left w:w="120" w:type="dxa"/>
+              <w:right w:w="120" w:type="dxa"/>
+            </w:tcMar>
+          </w:tcPr>
+          <w:p>
+            <w:pPr>
+              <w:spacing w:before="0" w:after="0"/>
+            </w:pPr>
+            <w:r>
+              <w:rPr>
+                <w:rFonts w:ascii="Calibri" w:hAnsi="Calibri"/>
+                <w:color w:val="141413"/>
+                <w:sz w:val="18"/>
+              </w:rPr>
+              <w:t>Section 1 (Financial Case) — when covering pricing models that reward specialist results</w:t>
             </w:r>
           </w:p>
         </w:tc>
@@ -10900,7 +11002,7 @@
       <w:tr>
         <w:tc>
           <w:tcPr>
-            <w:tcW w:type="dxa" w:w="4896"/>
+            <w:tcW w:type="dxa" w:w="3264"/>
             <w:shd w:val="clear" w:color="auto" w:fill="FFFFFF"/>
             <w:tcMar>
               <w:top w:w="80" w:type="dxa"/>
@@ -10919,13 +11021,13 @@
                 <w:color w:val="141413"/>
                 <w:sz w:val="18"/>
               </w:rPr>
-              <w:t>Social Media Agency Software</w:t>
+              <w:t>Social media management cost: how much to charge</w:t>
             </w:r>
           </w:p>
         </w:tc>
         <w:tc>
           <w:tcPr>
-            <w:tcW w:type="dxa" w:w="4896"/>
+            <w:tcW w:type="dxa" w:w="3264"/>
             <w:shd w:val="clear" w:color="auto" w:fill="FFFFFF"/>
             <w:tcMar>
               <w:top w:w="80" w:type="dxa"/>
@@ -10944,7 +11046,32 @@
                 <w:color w:val="141413"/>
                 <w:sz w:val="18"/>
               </w:rPr>
-              <w:t>SocialPilot features page for agencies</w:t>
+              <w:t>https://www.socialpilot.co/blog/social-media-management-cost</w:t>
+            </w:r>
+          </w:p>
+        </w:tc>
+        <w:tc>
+          <w:tcPr>
+            <w:tcW w:type="dxa" w:w="3264"/>
+            <w:shd w:val="clear" w:color="auto" w:fill="FFFFFF"/>
+            <w:tcMar>
+              <w:top w:w="80" w:type="dxa"/>
+              <w:bottom w:w="80" w:type="dxa"/>
+              <w:left w:w="120" w:type="dxa"/>
+              <w:right w:w="120" w:type="dxa"/>
+            </w:tcMar>
+          </w:tcPr>
+          <w:p>
+            <w:pPr>
+              <w:spacing w:before="0" w:after="0"/>
+            </w:pPr>
+            <w:r>
+              <w:rPr>
+                <w:rFonts w:ascii="Calibri" w:hAnsi="Calibri"/>
+                <w:color w:val="141413"/>
+                <w:sz w:val="18"/>
+              </w:rPr>
+              <w:t>Section 1 (Financial Case) or niche pricing table — when referencing rate benchmarks</w:t>
             </w:r>
           </w:p>
         </w:tc>
@@ -10952,7 +11079,7 @@
       <w:tr>
         <w:tc>
           <w:tcPr>
-            <w:tcW w:type="dxa" w:w="4896"/>
+            <w:tcW w:type="dxa" w:w="3264"/>
             <w:shd w:val="clear" w:color="auto" w:fill="EEF2FF"/>
             <w:tcMar>
               <w:top w:w="80" w:type="dxa"/>
@@ -10971,13 +11098,13 @@
                 <w:color w:val="141413"/>
                 <w:sz w:val="18"/>
               </w:rPr>
-              <w:t>How to Scale a Social Media Agency</w:t>
+              <w:t>Client retention: challenges, strategies and more</w:t>
             </w:r>
           </w:p>
         </w:tc>
         <w:tc>
           <w:tcPr>
-            <w:tcW w:type="dxa" w:w="4896"/>
+            <w:tcW w:type="dxa" w:w="3264"/>
             <w:shd w:val="clear" w:color="auto" w:fill="EEF2FF"/>
             <w:tcMar>
               <w:top w:w="80" w:type="dxa"/>
@@ -10996,7 +11123,32 @@
                 <w:color w:val="141413"/>
                 <w:sz w:val="18"/>
               </w:rPr>
-              <w:t>SocialPilot blog — agency growth</w:t>
+              <w:t>https://www.socialpilot.co/agency-success-guide/client-retention</w:t>
+            </w:r>
+          </w:p>
+        </w:tc>
+        <w:tc>
+          <w:tcPr>
+            <w:tcW w:type="dxa" w:w="3264"/>
+            <w:shd w:val="clear" w:color="auto" w:fill="EEF2FF"/>
+            <w:tcMar>
+              <w:top w:w="80" w:type="dxa"/>
+              <w:bottom w:w="80" w:type="dxa"/>
+              <w:left w:w="120" w:type="dxa"/>
+              <w:right w:w="120" w:type="dxa"/>
+            </w:tcMar>
+          </w:tcPr>
+          <w:p>
+            <w:pPr>
+              <w:spacing w:before="0" w:after="0"/>
+            </w:pPr>
+            <w:r>
+              <w:rPr>
+                <w:rFonts w:ascii="Calibri" w:hAnsi="Calibri"/>
+                <w:color w:val="141413"/>
+                <w:sz w:val="18"/>
+              </w:rPr>
+              <w:t>Section 1 (Financial Case) — when covering the retention advantage of niche agencies</w:t>
             </w:r>
           </w:p>
         </w:tc>
@@ -11004,7 +11156,7 @@
       <w:tr>
         <w:tc>
           <w:tcPr>
-            <w:tcW w:type="dxa" w:w="4896"/>
+            <w:tcW w:type="dxa" w:w="3264"/>
             <w:shd w:val="clear" w:color="auto" w:fill="FFFFFF"/>
             <w:tcMar>
               <w:top w:w="80" w:type="dxa"/>
@@ -11023,13 +11175,13 @@
                 <w:color w:val="141413"/>
                 <w:sz w:val="18"/>
               </w:rPr>
-              <w:t>Social Media Reporting for Agencies</w:t>
+              <w:t>White-label social media reporting for agencies</w:t>
             </w:r>
           </w:p>
         </w:tc>
         <w:tc>
           <w:tcPr>
-            <w:tcW w:type="dxa" w:w="4896"/>
+            <w:tcW w:type="dxa" w:w="3264"/>
             <w:shd w:val="clear" w:color="auto" w:fill="FFFFFF"/>
             <w:tcMar>
               <w:top w:w="80" w:type="dxa"/>
@@ -11048,7 +11200,32 @@
                 <w:color w:val="141413"/>
                 <w:sz w:val="18"/>
               </w:rPr>
-              <w:t>SocialPilot blog — client reporting</w:t>
+              <w:t>https://www.socialpilot.co/blog/white-label-social-media-reporting</w:t>
+            </w:r>
+          </w:p>
+        </w:tc>
+        <w:tc>
+          <w:tcPr>
+            <w:tcW w:type="dxa" w:w="3264"/>
+            <w:shd w:val="clear" w:color="auto" w:fill="FFFFFF"/>
+            <w:tcMar>
+              <w:top w:w="80" w:type="dxa"/>
+              <w:bottom w:w="80" w:type="dxa"/>
+              <w:left w:w="120" w:type="dxa"/>
+              <w:right w:w="120" w:type="dxa"/>
+            </w:tcMar>
+          </w:tcPr>
+          <w:p>
+            <w:pPr>
+              <w:spacing w:before="0" w:after="0"/>
+            </w:pPr>
+            <w:r>
+              <w:rPr>
+                <w:rFonts w:ascii="Calibri" w:hAnsi="Calibri"/>
+                <w:color w:val="141413"/>
+                <w:sz w:val="18"/>
+              </w:rPr>
+              <w:t>Section 3 (Operational Dividend) — when discussing systemised delivery and reporting</w:t>
             </w:r>
           </w:p>
         </w:tc>
@@ -11056,7 +11233,7 @@
       <w:tr>
         <w:tc>
           <w:tcPr>
-            <w:tcW w:type="dxa" w:w="4896"/>
+            <w:tcW w:type="dxa" w:w="3264"/>
             <w:shd w:val="clear" w:color="auto" w:fill="EEF2FF"/>
             <w:tcMar>
               <w:top w:w="80" w:type="dxa"/>
@@ -11075,13 +11252,13 @@
                 <w:color w:val="141413"/>
                 <w:sz w:val="18"/>
               </w:rPr>
-              <w:t>SocialPilot for Agencies</w:t>
+              <w:t>How to upsell social media clients</w:t>
             </w:r>
           </w:p>
         </w:tc>
         <w:tc>
           <w:tcPr>
-            <w:tcW w:type="dxa" w:w="4896"/>
+            <w:tcW w:type="dxa" w:w="3264"/>
             <w:shd w:val="clear" w:color="auto" w:fill="EEF2FF"/>
             <w:tcMar>
               <w:top w:w="80" w:type="dxa"/>
@@ -11100,7 +11277,263 @@
                 <w:color w:val="141413"/>
                 <w:sz w:val="18"/>
               </w:rPr>
-              <w:t>SocialPilot agency solutions landing page</w:t>
+              <w:t>https://www.socialpilot.co/blog/upsell-social-media-clients</w:t>
+            </w:r>
+          </w:p>
+        </w:tc>
+        <w:tc>
+          <w:tcPr>
+            <w:tcW w:type="dxa" w:w="3264"/>
+            <w:shd w:val="clear" w:color="auto" w:fill="EEF2FF"/>
+            <w:tcMar>
+              <w:top w:w="80" w:type="dxa"/>
+              <w:bottom w:w="80" w:type="dxa"/>
+              <w:left w:w="120" w:type="dxa"/>
+              <w:right w:w="120" w:type="dxa"/>
+            </w:tcMar>
+          </w:tcPr>
+          <w:p>
+            <w:pPr>
+              <w:spacing w:before="0" w:after="0"/>
+            </w:pPr>
+            <w:r>
+              <w:rPr>
+                <w:rFonts w:ascii="Calibri" w:hAnsi="Calibri"/>
+                <w:color w:val="141413"/>
+                <w:sz w:val="18"/>
+              </w:rPr>
+              <w:t>Conclusion — once a niche is established, upselling deeper services is the growth lever</w:t>
+            </w:r>
+          </w:p>
+        </w:tc>
+      </w:tr>
+      <w:tr>
+        <w:tc>
+          <w:tcPr>
+            <w:tcW w:type="dxa" w:w="3264"/>
+            <w:shd w:val="clear" w:color="auto" w:fill="FFFFFF"/>
+            <w:tcMar>
+              <w:top w:w="80" w:type="dxa"/>
+              <w:bottom w:w="80" w:type="dxa"/>
+              <w:left w:w="120" w:type="dxa"/>
+              <w:right w:w="120" w:type="dxa"/>
+            </w:tcMar>
+          </w:tcPr>
+          <w:p>
+            <w:pPr>
+              <w:spacing w:before="0" w:after="0"/>
+            </w:pPr>
+            <w:r>
+              <w:rPr>
+                <w:rFonts w:ascii="Calibri" w:hAnsi="Calibri"/>
+                <w:color w:val="141413"/>
+                <w:sz w:val="18"/>
+              </w:rPr>
+              <w:t>Client onboarding guide for agencies</w:t>
+            </w:r>
+          </w:p>
+        </w:tc>
+        <w:tc>
+          <w:tcPr>
+            <w:tcW w:type="dxa" w:w="3264"/>
+            <w:shd w:val="clear" w:color="auto" w:fill="FFFFFF"/>
+            <w:tcMar>
+              <w:top w:w="80" w:type="dxa"/>
+              <w:bottom w:w="80" w:type="dxa"/>
+              <w:left w:w="120" w:type="dxa"/>
+              <w:right w:w="120" w:type="dxa"/>
+            </w:tcMar>
+          </w:tcPr>
+          <w:p>
+            <w:pPr>
+              <w:spacing w:before="0" w:after="0"/>
+            </w:pPr>
+            <w:r>
+              <w:rPr>
+                <w:rFonts w:ascii="Calibri" w:hAnsi="Calibri"/>
+                <w:color w:val="141413"/>
+                <w:sz w:val="18"/>
+              </w:rPr>
+              <w:t>https://www.socialpilot.co/agency-success-guide/guide-to-client-onboarding</w:t>
+            </w:r>
+          </w:p>
+        </w:tc>
+        <w:tc>
+          <w:tcPr>
+            <w:tcW w:type="dxa" w:w="3264"/>
+            <w:shd w:val="clear" w:color="auto" w:fill="FFFFFF"/>
+            <w:tcMar>
+              <w:top w:w="80" w:type="dxa"/>
+              <w:bottom w:w="80" w:type="dxa"/>
+              <w:left w:w="120" w:type="dxa"/>
+              <w:right w:w="120" w:type="dxa"/>
+            </w:tcMar>
+          </w:tcPr>
+          <w:p>
+            <w:pPr>
+              <w:spacing w:before="0" w:after="0"/>
+            </w:pPr>
+            <w:r>
+              <w:rPr>
+                <w:rFonts w:ascii="Calibri" w:hAnsi="Calibri"/>
+                <w:color w:val="141413"/>
+                <w:sz w:val="18"/>
+              </w:rPr>
+              <w:t>Section 3 (Operational Dividend) — when covering faster onboarding in a specialised niche</w:t>
+            </w:r>
+          </w:p>
+        </w:tc>
+      </w:tr>
+      <w:tr>
+        <w:tc>
+          <w:tcPr>
+            <w:tcW w:type="dxa" w:w="3264"/>
+            <w:shd w:val="clear" w:color="auto" w:fill="EEF2FF"/>
+            <w:tcMar>
+              <w:top w:w="80" w:type="dxa"/>
+              <w:bottom w:w="80" w:type="dxa"/>
+              <w:left w:w="120" w:type="dxa"/>
+              <w:right w:w="120" w:type="dxa"/>
+            </w:tcMar>
+          </w:tcPr>
+          <w:p>
+            <w:pPr>
+              <w:spacing w:before="0" w:after="0"/>
+            </w:pPr>
+            <w:r>
+              <w:rPr>
+                <w:rFonts w:ascii="Calibri" w:hAnsi="Calibri"/>
+                <w:color w:val="141413"/>
+                <w:sz w:val="18"/>
+              </w:rPr>
+              <w:t>SocialPilot for agencies</w:t>
+            </w:r>
+          </w:p>
+        </w:tc>
+        <w:tc>
+          <w:tcPr>
+            <w:tcW w:type="dxa" w:w="3264"/>
+            <w:shd w:val="clear" w:color="auto" w:fill="EEF2FF"/>
+            <w:tcMar>
+              <w:top w:w="80" w:type="dxa"/>
+              <w:bottom w:w="80" w:type="dxa"/>
+              <w:left w:w="120" w:type="dxa"/>
+              <w:right w:w="120" w:type="dxa"/>
+            </w:tcMar>
+          </w:tcPr>
+          <w:p>
+            <w:pPr>
+              <w:spacing w:before="0" w:after="0"/>
+            </w:pPr>
+            <w:r>
+              <w:rPr>
+                <w:rFonts w:ascii="Calibri" w:hAnsi="Calibri"/>
+                <w:color w:val="141413"/>
+                <w:sz w:val="18"/>
+              </w:rPr>
+              <w:t>https://www.socialpilot.co/solutions/agencies</w:t>
+            </w:r>
+          </w:p>
+        </w:tc>
+        <w:tc>
+          <w:tcPr>
+            <w:tcW w:type="dxa" w:w="3264"/>
+            <w:shd w:val="clear" w:color="auto" w:fill="EEF2FF"/>
+            <w:tcMar>
+              <w:top w:w="80" w:type="dxa"/>
+              <w:bottom w:w="80" w:type="dxa"/>
+              <w:left w:w="120" w:type="dxa"/>
+              <w:right w:w="120" w:type="dxa"/>
+            </w:tcMar>
+          </w:tcPr>
+          <w:p>
+            <w:pPr>
+              <w:spacing w:before="0" w:after="0"/>
+            </w:pPr>
+            <w:r>
+              <w:rPr>
+                <w:rFonts w:ascii="Calibri" w:hAnsi="Calibri"/>
+                <w:color w:val="141413"/>
+                <w:sz w:val="18"/>
+              </w:rPr>
+              <w:t>Section 3 or CTA — main agency solutions page</w:t>
+            </w:r>
+          </w:p>
+        </w:tc>
+      </w:tr>
+      <w:tr>
+        <w:tc>
+          <w:tcPr>
+            <w:tcW w:type="dxa" w:w="3264"/>
+            <w:shd w:val="clear" w:color="auto" w:fill="FFFFFF"/>
+            <w:tcMar>
+              <w:top w:w="80" w:type="dxa"/>
+              <w:bottom w:w="80" w:type="dxa"/>
+              <w:left w:w="120" w:type="dxa"/>
+              <w:right w:w="120" w:type="dxa"/>
+            </w:tcMar>
+          </w:tcPr>
+          <w:p>
+            <w:pPr>
+              <w:spacing w:before="0" w:after="0"/>
+            </w:pPr>
+            <w:r>
+              <w:rPr>
+                <w:rFonts w:ascii="Calibri" w:hAnsi="Calibri"/>
+                <w:color w:val="141413"/>
+                <w:sz w:val="18"/>
+              </w:rPr>
+              <w:t>Agency Success Guide hub</w:t>
+            </w:r>
+          </w:p>
+        </w:tc>
+        <w:tc>
+          <w:tcPr>
+            <w:tcW w:type="dxa" w:w="3264"/>
+            <w:shd w:val="clear" w:color="auto" w:fill="FFFFFF"/>
+            <w:tcMar>
+              <w:top w:w="80" w:type="dxa"/>
+              <w:bottom w:w="80" w:type="dxa"/>
+              <w:left w:w="120" w:type="dxa"/>
+              <w:right w:w="120" w:type="dxa"/>
+            </w:tcMar>
+          </w:tcPr>
+          <w:p>
+            <w:pPr>
+              <w:spacing w:before="0" w:after="0"/>
+            </w:pPr>
+            <w:r>
+              <w:rPr>
+                <w:rFonts w:ascii="Calibri" w:hAnsi="Calibri"/>
+                <w:color w:val="141413"/>
+                <w:sz w:val="18"/>
+              </w:rPr>
+              <w:t>https://www.socialpilot.co/agency-success-guide</w:t>
+            </w:r>
+          </w:p>
+        </w:tc>
+        <w:tc>
+          <w:tcPr>
+            <w:tcW w:type="dxa" w:w="3264"/>
+            <w:shd w:val="clear" w:color="auto" w:fill="FFFFFF"/>
+            <w:tcMar>
+              <w:top w:w="80" w:type="dxa"/>
+              <w:bottom w:w="80" w:type="dxa"/>
+              <w:left w:w="120" w:type="dxa"/>
+              <w:right w:w="120" w:type="dxa"/>
+            </w:tcMar>
+          </w:tcPr>
+          <w:p>
+            <w:pPr>
+              <w:spacing w:before="0" w:after="0"/>
+            </w:pPr>
+            <w:r>
+              <w:rPr>
+                <w:rFonts w:ascii="Calibri" w:hAnsi="Calibri"/>
+                <w:color w:val="141413"/>
+                <w:sz w:val="18"/>
+              </w:rPr>
+              <w:t>Conclusion — signpost readers to broader agency growth resources</w:t>
             </w:r>
           </w:p>
         </w:tc>

</xml_diff>